<commit_message>
Expand manuscript references from 3 to 18, fix affiliations
References added: Viechtbauer (metafor), Higgins & Thompson (I2),
IntHout (HKSJ), Walsh (fragility index), Atal (MA fragility),
Guyatt (GRADE), Cochrane Handbook, Schwarzer (Meta-Analysis with R),
Harrell (optimism), Burkner (brms), Borenstein (intro MA), R Core Team,
PRISMA 2020, Egger (pub bias), Duval (trim-fill), Stanley (PET-PEESE),
NICE methods guide.

Affiliations updated to match other manuscripts (Royal Free London
NHS Foundation Trust, Tahir Heart Institute, KCL GKT, St George's).

Co-Authored-By: Claude Opus 4.6 (1M context) <noreply@anthropic.com>
</commit_message>
<xml_diff>
--- a/F1000_MLM501_Software_Article_v6.docx
+++ b/F1000_MLM501_Software_Article_v6.docx
@@ -39,13 +39,13 @@
     </w:p>
     <w:p>
       <w:r>
-        <w:t>1. National Health Service (NHS), UK</w:t>
+        <w:t>1. Royal Free London NHS Foundation Trust, London, UK</w:t>
         <w:br/>
-        <w:t>2. Royal Free Hospital, London, UK</w:t>
+        <w:t>2. Tahir Heart Institute, Rabwah, Pakistan</w:t>
         <w:br/>
-        <w:t>3. King's College London Medical School, London, UK</w:t>
+        <w:t>3. King's College London GKT School of Medical Education, London, UK</w:t>
         <w:br/>
-        <w:t>4. St George's Hospital, London, UK</w:t>
+        <w:t>4. St George's, University of London, London, UK</w:t>
       </w:r>
     </w:p>
     <w:p>
@@ -4484,11 +4484,146 @@
     </w:p>
     <w:p>
       <w:r>
-        <w:t>1. DerSimonian R, Laird N. Meta-analysis in clinical trials. Controlled Clinical Trials. 1986.</w:t>
-        <w:br/>
-        <w:t>2. Ahmad M et al. The Meta-Analysis Fragility Index 2.0. NHS Technical Series. 2026.</w:t>
-        <w:br/>
-        <w:t>3. IntHout J et al. The Hartung-Knapp-Sidik-Jonkman method... BMC Med Res Methodol. 2014.</w:t>
+        <w:rPr>
+          <w:sz w:val="18"/>
+        </w:rPr>
+        <w:t>1. DerSimonian R, Laird N. Meta-analysis in clinical trials. Control Clin Trials. 1986;7(3):177-188. doi:10.1016/0197-2456(86)90046-2</w:t>
+      </w:r>
+    </w:p>
+    <w:p>
+      <w:r>
+        <w:rPr>
+          <w:sz w:val="18"/>
+        </w:rPr>
+        <w:t>2. Viechtbauer W. Conducting meta-analyses in R with the metafor package. J Stat Softw. 2010;36(3):1-48. doi:10.18637/jss.v036.i03</w:t>
+      </w:r>
+    </w:p>
+    <w:p>
+      <w:r>
+        <w:rPr>
+          <w:sz w:val="18"/>
+        </w:rPr>
+        <w:t>3. Higgins JPT, Thompson SG. Quantifying heterogeneity in a meta-analysis. Stat Med. 2002;21(11):1539-1558. doi:10.1002/sim.1186</w:t>
+      </w:r>
+    </w:p>
+    <w:p>
+      <w:r>
+        <w:rPr>
+          <w:sz w:val="18"/>
+        </w:rPr>
+        <w:t>4. IntHout J, Ioannidis JP, Borm GF. The Hartung-Knapp-Sidik-Jonkman method for random effects meta-analysis is straightforward and considerably outperforms the standard DerSimonian-Laird method. BMC Med Res Methodol. 2014;14:25. doi:10.1186/1471-2288-14-25</w:t>
+      </w:r>
+    </w:p>
+    <w:p>
+      <w:r>
+        <w:rPr>
+          <w:sz w:val="18"/>
+        </w:rPr>
+        <w:t>5. Walsh M, Srinathan SK, McAuley DF, et al. The statistical significance of randomized controlled trial results is frequently fragile: a case for a Fragility Index. J Clin Epidemiol. 2014;67(6):622-628. doi:10.1016/j.jclinepi.2013.10.019</w:t>
+      </w:r>
+    </w:p>
+    <w:p>
+      <w:r>
+        <w:rPr>
+          <w:sz w:val="18"/>
+        </w:rPr>
+        <w:t>6. Atal I, Porcher R, Boutron I, Ravaud P. The statistical significance of meta-analyses is frequently fragile: definition of a fragility index for meta-analyses. J Clin Epidemiol. 2019;111:32-40. doi:10.1016/j.jclinepi.2019.03.012</w:t>
+      </w:r>
+    </w:p>
+    <w:p>
+      <w:r>
+        <w:rPr>
+          <w:sz w:val="18"/>
+        </w:rPr>
+        <w:t>7. Guyatt GH, Oxman AD, Vist GE, et al. GRADE: an emerging consensus on rating quality of evidence and strength of recommendations. BMJ. 2008;336(7650):924-926. doi:10.1136/bmj.39489.470347.AD</w:t>
+      </w:r>
+    </w:p>
+    <w:p>
+      <w:r>
+        <w:rPr>
+          <w:sz w:val="18"/>
+        </w:rPr>
+        <w:t>8. Higgins JPT, Thomas J, Chandler J, et al. Cochrane Handbook for Systematic Reviews of Interventions version 6.4. Cochrane; 2023. Available from: www.training.cochrane.org/handbook</w:t>
+      </w:r>
+    </w:p>
+    <w:p>
+      <w:r>
+        <w:rPr>
+          <w:sz w:val="18"/>
+        </w:rPr>
+        <w:t>9. Schwarzer G, Carpenter JR, Rucker G. Meta-Analysis with R. Cham: Springer; 2015. doi:10.1007/978-3-319-21416-0</w:t>
+      </w:r>
+    </w:p>
+    <w:p>
+      <w:r>
+        <w:rPr>
+          <w:sz w:val="18"/>
+        </w:rPr>
+        <w:t>10. Harrell FE, Lee KL, Mark DB. Multivariable prognostic models: issues in developing models, evaluating assumptions and adequacy, and measuring and reducing errors. Stat Med. 1996;15(4):361-387.</w:t>
+      </w:r>
+    </w:p>
+    <w:p>
+      <w:r>
+        <w:rPr>
+          <w:sz w:val="18"/>
+        </w:rPr>
+        <w:t>11. Burkner PC. brms: An R Package for Bayesian Multilevel Models Using Stan. J Stat Softw. 2017;80(1):1-28. doi:10.18637/jss.v080.i01</w:t>
+      </w:r>
+    </w:p>
+    <w:p>
+      <w:r>
+        <w:rPr>
+          <w:sz w:val="18"/>
+        </w:rPr>
+        <w:t>12. Borenstein M, Hedges LV, Higgins JPT, Rothstein HR. Introduction to Meta-Analysis. Chichester: John Wiley &amp; Sons; 2009. doi:10.1002/9780470743386</w:t>
+      </w:r>
+    </w:p>
+    <w:p>
+      <w:r>
+        <w:rPr>
+          <w:sz w:val="18"/>
+        </w:rPr>
+        <w:t>13. R Core Team. R: A Language and Environment for Statistical Computing. Vienna, Austria: R Foundation for Statistical Computing; 2024. https://www.R-project.org/</w:t>
+      </w:r>
+    </w:p>
+    <w:p>
+      <w:r>
+        <w:rPr>
+          <w:sz w:val="18"/>
+        </w:rPr>
+        <w:t>14. Page MJ, McKenzie JE, Bossuyt PM, et al. The PRISMA 2020 statement: an updated guideline for reporting systematic reviews. BMJ. 2021;372:n71. doi:10.1136/bmj.n71</w:t>
+      </w:r>
+    </w:p>
+    <w:p>
+      <w:r>
+        <w:rPr>
+          <w:sz w:val="18"/>
+        </w:rPr>
+        <w:t>15. Egger M, Davey Smith G, Schneider M, Minder C. Bias in meta-analysis detected by a simple, graphical test. BMJ. 1997;315(7109):629-634. doi:10.1136/bmj.315.7109.629</w:t>
+      </w:r>
+    </w:p>
+    <w:p>
+      <w:r>
+        <w:rPr>
+          <w:sz w:val="18"/>
+        </w:rPr>
+        <w:t>16. Duval S, Tweedie R. Trim and fill: a simple funnel-plot-based method of testing and adjusting for publication bias in meta-analysis. Biometrics. 2000;56(2):455-463. doi:10.1111/j.0006-341X.2000.00455.x</w:t>
+      </w:r>
+    </w:p>
+    <w:p>
+      <w:r>
+        <w:rPr>
+          <w:sz w:val="18"/>
+        </w:rPr>
+        <w:t>17. Stanley TD, Doucouliagos H. Meta-regression approximations to reduce publication selection bias. Res Synth Methods. 2014;5(1):60-78. doi:10.1002/jrsm.1095</w:t>
+      </w:r>
+    </w:p>
+    <w:p>
+      <w:r>
+        <w:rPr>
+          <w:sz w:val="18"/>
+        </w:rPr>
+        <w:t>18. National Institute for Health and Care Excellence (NICE). Guide to the Methods of Technology Appraisal 2013. London: NICE; 2013.</w:t>
       </w:r>
     </w:p>
     <w:sectPr>

</xml_diff>